<commit_message>
changes in main page
</commit_message>
<xml_diff>
--- a/cv/hasnain.docx
+++ b/cv/hasnain.docx
@@ -14,7 +14,6 @@
         <w:rPr>
           <w:b/>
           <w:noProof/>
-          <w:lang w:val="en-US" w:eastAsia="en-US"/>
         </w:rPr>
         <mc:AlternateContent>
           <mc:Choice Requires="wpg">
@@ -890,7 +889,7 @@
               </wp:anchor>
             </w:drawing>
           </mc:Choice>
-          <mc:Fallback xmlns:w16cid="http://schemas.microsoft.com/office/word/2016/wordml/cid" xmlns:am3d="http://schemas.microsoft.com/office/drawing/2017/model3d" xmlns:aink="http://schemas.microsoft.com/office/drawing/2016/ink" xmlns:cx8="http://schemas.microsoft.com/office/drawing/2016/5/14/chartex" xmlns:cx7="http://schemas.microsoft.com/office/drawing/2016/5/13/chartex" xmlns:cx6="http://schemas.microsoft.com/office/drawing/2016/5/12/chartex" xmlns:cx5="http://schemas.microsoft.com/office/drawing/2016/5/11/chartex" xmlns:cx4="http://schemas.microsoft.com/office/drawing/2016/5/10/chartex" xmlns:cx3="http://schemas.microsoft.com/office/drawing/2016/5/9/chartex" xmlns:cx2="http://schemas.microsoft.com/office/drawing/2015/10/21/chartex">
+          <mc:Fallback xmlns:cx2="http://schemas.microsoft.com/office/drawing/2015/10/21/chartex" xmlns:cx3="http://schemas.microsoft.com/office/drawing/2016/5/9/chartex" xmlns:cx4="http://schemas.microsoft.com/office/drawing/2016/5/10/chartex" xmlns:cx5="http://schemas.microsoft.com/office/drawing/2016/5/11/chartex" xmlns:cx6="http://schemas.microsoft.com/office/drawing/2016/5/12/chartex" xmlns:cx7="http://schemas.microsoft.com/office/drawing/2016/5/13/chartex" xmlns:cx8="http://schemas.microsoft.com/office/drawing/2016/5/14/chartex" xmlns:aink="http://schemas.microsoft.com/office/drawing/2016/ink" xmlns:am3d="http://schemas.microsoft.com/office/drawing/2017/model3d" xmlns:w16cid="http://schemas.microsoft.com/office/word/2016/wordml/cid">
             <w:pict>
               <v:group w14:anchorId="1964BDB0" id="Group 3011" o:spid="_x0000_s1026" style="position:absolute;margin-left:-8.65pt;margin-top:-77.25pt;width:595.3pt;height:843.75pt;z-index:-251658240;mso-height-relative:margin" coordsize="75605,97694" o:gfxdata="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">
                 <v:shapetype id="_x0000_t75" coordsize="21600,21600" o:spt="75" o:preferrelative="t" path="m@4@5l@4@11@9@11@9@5xe" filled="f" stroked="f">
@@ -1121,170 +1120,13 @@
     </w:p>
     <w:p>
       <w:pPr>
-        <w:spacing w:after="322" w:line="260" w:lineRule="auto"/>
-        <w:ind w:left="566"/>
-      </w:pPr>
-      <w:hyperlink r:id="rId22">
-        <w:r>
-          <w:rPr>
-            <w:color w:val="FFFFFF"/>
-            <w:sz w:val="20"/>
-            <w:u w:val="single" w:color="FFFFFF"/>
-          </w:rPr>
-          <w:t xml:space="preserve">https://www.linkedin.com/in/ </w:t>
-        </w:r>
-      </w:hyperlink>
-      <w:hyperlink r:id="rId23">
-        <w:r>
-          <w:rPr>
-            <w:color w:val="FFFFFF"/>
-            <w:sz w:val="20"/>
-            <w:u w:val="single" w:color="FFFFFF"/>
-          </w:rPr>
-          <w:t>hasnain</w:t>
-        </w:r>
-      </w:hyperlink>
-      <w:hyperlink r:id="rId24">
-        <w:r>
-          <w:rPr>
-            <w:color w:val="FFFFFF"/>
-            <w:sz w:val="20"/>
-            <w:u w:val="single" w:color="FFFFFF"/>
-          </w:rPr>
-          <w:t>-</w:t>
-        </w:r>
-      </w:hyperlink>
-      <w:hyperlink r:id="rId25">
-        <w:r>
-          <w:rPr>
-            <w:color w:val="FFFFFF"/>
-            <w:sz w:val="20"/>
-            <w:u w:val="single" w:color="FFFFFF"/>
-          </w:rPr>
-          <w:t>ali</w:t>
-        </w:r>
-      </w:hyperlink>
-      <w:hyperlink r:id="rId26">
-        <w:r>
-          <w:rPr>
-            <w:color w:val="FFFFFF"/>
-            <w:sz w:val="20"/>
-            <w:u w:val="single" w:color="FFFFFF"/>
-          </w:rPr>
-          <w:t>-</w:t>
-        </w:r>
-      </w:hyperlink>
-      <w:hyperlink r:id="rId27">
-        <w:r>
-          <w:rPr>
-            <w:color w:val="FFFFFF"/>
-            <w:sz w:val="20"/>
-            <w:u w:val="single" w:color="FFFFFF"/>
-          </w:rPr>
-          <w:t>515443269?utm</w:t>
-        </w:r>
-      </w:hyperlink>
-      <w:hyperlink r:id="rId28"/>
-      <w:hyperlink r:id="rId29">
-        <w:r>
-          <w:rPr>
-            <w:color w:val="FFFFFF"/>
-            <w:sz w:val="20"/>
-            <w:u w:val="single" w:color="FFFFFF"/>
-          </w:rPr>
-          <w:t>source=share&amp;utm</w:t>
-        </w:r>
-      </w:hyperlink>
-      <w:hyperlink r:id="rId30"/>
-      <w:hyperlink r:id="rId31">
-        <w:r>
-          <w:rPr>
-            <w:color w:val="FFFFFF"/>
-            <w:sz w:val="20"/>
-            <w:u w:val="single" w:color="FFFFFF"/>
-          </w:rPr>
-          <w:t>campaign=share</w:t>
-        </w:r>
-      </w:hyperlink>
-      <w:hyperlink r:id="rId32">
-        <w:r>
-          <w:rPr>
-            <w:color w:val="FFFFFF"/>
-            <w:sz w:val="20"/>
-            <w:u w:val="single" w:color="FFFFFF"/>
-          </w:rPr>
-          <w:t>-</w:t>
-        </w:r>
-      </w:hyperlink>
-      <w:hyperlink r:id="rId33">
-        <w:r>
-          <w:rPr>
-            <w:color w:val="FFFFFF"/>
-            <w:sz w:val="20"/>
-            <w:u w:val="single" w:color="FFFFFF"/>
-          </w:rPr>
-          <w:t>via&amp;utm</w:t>
-        </w:r>
-      </w:hyperlink>
-      <w:hyperlink r:id="rId34"/>
-      <w:hyperlink r:id="rId35">
-        <w:r>
-          <w:rPr>
-            <w:color w:val="FFFFFF"/>
-            <w:sz w:val="20"/>
-            <w:u w:val="single" w:color="FFFFFF"/>
-          </w:rPr>
-          <w:t>content=profile&amp;utm</w:t>
-        </w:r>
-      </w:hyperlink>
-      <w:hyperlink r:id="rId36"/>
-      <w:hyperlink r:id="rId37">
-        <w:r>
-          <w:rPr>
-            <w:color w:val="FFFFFF"/>
-            <w:sz w:val="20"/>
-            <w:u w:val="single" w:color="FFFFFF"/>
-          </w:rPr>
-          <w:t>medium=android</w:t>
-        </w:r>
-      </w:hyperlink>
-      <w:hyperlink r:id="rId38">
-        <w:r>
-          <w:rPr>
-            <w:color w:val="FFFFFF"/>
-            <w:sz w:val="20"/>
-            <w:u w:val="single" w:color="FFFFFF"/>
-          </w:rPr>
-          <w:t>-</w:t>
-        </w:r>
-      </w:hyperlink>
-      <w:hyperlink r:id="rId39">
-        <w:r>
-          <w:rPr>
-            <w:color w:val="FFFFFF"/>
-            <w:sz w:val="20"/>
-            <w:u w:val="single" w:color="FFFFFF"/>
-          </w:rPr>
-          <w:t>app</w:t>
-        </w:r>
-      </w:hyperlink>
-      <w:hyperlink r:id="rId40">
-        <w:r>
-          <w:rPr>
-            <w:color w:val="FFFFFF"/>
-            <w:sz w:val="20"/>
-          </w:rPr>
-          <w:t xml:space="preserve"> </w:t>
-        </w:r>
-      </w:hyperlink>
-    </w:p>
-    <w:p>
-      <w:pPr>
         <w:pStyle w:val="Heading1"/>
         <w:tabs>
           <w:tab w:val="center" w:pos="2703"/>
         </w:tabs>
       </w:pPr>
+      <w:bookmarkStart w:id="0" w:name="_GoBack"/>
+      <w:bookmarkEnd w:id="0"/>
       <w:r>
         <w:t xml:space="preserve">      MY SKILLS</w:t>
       </w:r>
@@ -1457,7 +1299,7 @@
         <w:spacing w:after="81" w:line="314" w:lineRule="auto"/>
         <w:ind w:left="343"/>
       </w:pPr>
-      <w:hyperlink r:id="rId41">
+      <w:hyperlink r:id="rId22">
         <w:r>
           <w:rPr>
             <w:b/>
@@ -1468,7 +1310,7 @@
           <w:t xml:space="preserve">https://honeycombd </w:t>
         </w:r>
       </w:hyperlink>
-      <w:hyperlink r:id="rId42">
+      <w:hyperlink r:id="rId23">
         <w:r>
           <w:rPr>
             <w:b/>
@@ -1479,7 +1321,7 @@
           <w:t>eals.com</w:t>
         </w:r>
       </w:hyperlink>
-      <w:hyperlink r:id="rId43">
+      <w:hyperlink r:id="rId24">
         <w:r>
           <w:rPr>
             <w:b/>
@@ -1489,7 +1331,7 @@
           <w:t xml:space="preserve"> </w:t>
         </w:r>
       </w:hyperlink>
-      <w:hyperlink r:id="rId44">
+      <w:hyperlink r:id="rId25">
         <w:r>
           <w:rPr>
             <w:b/>
@@ -1500,7 +1342,7 @@
           <w:t xml:space="preserve">https://budgetheave </w:t>
         </w:r>
       </w:hyperlink>
-      <w:hyperlink r:id="rId45">
+      <w:hyperlink r:id="rId26">
         <w:r>
           <w:rPr>
             <w:b/>
@@ -1511,7 +1353,7 @@
           <w:t>n.com</w:t>
         </w:r>
       </w:hyperlink>
-      <w:hyperlink r:id="rId46">
+      <w:hyperlink r:id="rId27">
         <w:r>
           <w:rPr>
             <w:b/>
@@ -1521,7 +1363,7 @@
           <w:t xml:space="preserve"> </w:t>
         </w:r>
       </w:hyperlink>
-      <w:hyperlink r:id="rId47">
+      <w:hyperlink r:id="rId28">
         <w:r>
           <w:rPr>
             <w:b/>
@@ -1532,7 +1374,7 @@
           <w:t>https://deals69.com</w:t>
         </w:r>
       </w:hyperlink>
-      <w:hyperlink r:id="rId48">
+      <w:hyperlink r:id="rId29">
         <w:r>
           <w:rPr>
             <w:b/>
@@ -1542,7 +1384,7 @@
           <w:t xml:space="preserve"> </w:t>
         </w:r>
       </w:hyperlink>
-      <w:hyperlink r:id="rId49">
+      <w:hyperlink r:id="rId30">
         <w:r>
           <w:rPr>
             <w:b/>
@@ -1553,7 +1395,7 @@
           <w:t xml:space="preserve">https://vouchmenot. </w:t>
         </w:r>
       </w:hyperlink>
-      <w:hyperlink r:id="rId50">
+      <w:hyperlink r:id="rId31">
         <w:r>
           <w:rPr>
             <w:b/>
@@ -1564,7 +1406,7 @@
           <w:t>com</w:t>
         </w:r>
       </w:hyperlink>
-      <w:hyperlink r:id="rId51">
+      <w:hyperlink r:id="rId32">
         <w:r>
           <w:rPr>
             <w:b/>
@@ -1594,8 +1436,6 @@
         <w:ind w:left="819"/>
         <w:jc w:val="center"/>
       </w:pPr>
-      <w:bookmarkStart w:id="0" w:name="_GoBack"/>
-      <w:bookmarkEnd w:id="0"/>
       <w:r>
         <w:rPr>
           <w:rFonts w:ascii="Times New Roman" w:eastAsia="Times New Roman" w:hAnsi="Times New Roman" w:cs="Times New Roman"/>
@@ -1652,7 +1492,6 @@
         <w:rPr>
           <w:b/>
           <w:sz w:val="32"/>
-          <w:lang w:val="en-US"/>
         </w:rPr>
         <w:t>1</w:t>
       </w:r>
@@ -1687,7 +1526,6 @@
         <w:rPr>
           <w:b/>
           <w:sz w:val="36"/>
-          <w:lang w:val="en-US"/>
         </w:rPr>
         <w:t xml:space="preserve">   </w:t>
       </w:r>
@@ -2048,7 +1886,6 @@
             <w:r>
               <w:rPr>
                 <w:noProof/>
-                <w:lang w:val="en-US" w:eastAsia="en-US"/>
               </w:rPr>
               <mc:AlternateContent>
                 <mc:Choice Requires="wpg">
@@ -2130,7 +1967,7 @@
                                 <pic:cNvPicPr/>
                               </pic:nvPicPr>
                               <pic:blipFill>
-                                <a:blip r:embed="rId52"/>
+                                <a:blip r:embed="rId33"/>
                                 <a:stretch>
                                   <a:fillRect/>
                                 </a:stretch>
@@ -2163,7 +2000,7 @@
                               <wps:txbx>
                                 <w:txbxContent>
                                   <w:p>
-                                    <w:hyperlink r:id="rId53">
+                                    <w:hyperlink r:id="rId34">
                                       <w:r>
                                         <w:rPr>
                                           <w:rFonts w:ascii="Arial" w:eastAsia="Arial" w:hAnsi="Arial" w:cs="Arial"/>
@@ -2186,7 +2023,7 @@
                                 <pic:cNvPicPr/>
                               </pic:nvPicPr>
                               <pic:blipFill>
-                                <a:blip r:embed="rId52"/>
+                                <a:blip r:embed="rId33"/>
                                 <a:stretch>
                                   <a:fillRect/>
                                 </a:stretch>
@@ -2219,7 +2056,7 @@
                               <wps:txbx>
                                 <w:txbxContent>
                                   <w:p>
-                                    <w:hyperlink r:id="rId54">
+                                    <w:hyperlink r:id="rId35">
                                       <w:r>
                                         <w:rPr>
                                           <w:rFonts w:ascii="Arial" w:eastAsia="Arial" w:hAnsi="Arial" w:cs="Arial"/>
@@ -2242,7 +2079,7 @@
                     </wp:inline>
                   </w:drawing>
                 </mc:Choice>
-                <mc:Fallback xmlns:w16cid="http://schemas.microsoft.com/office/word/2016/wordml/cid" xmlns:am3d="http://schemas.microsoft.com/office/drawing/2017/model3d" xmlns:aink="http://schemas.microsoft.com/office/drawing/2016/ink" xmlns:cx8="http://schemas.microsoft.com/office/drawing/2016/5/14/chartex" xmlns:cx7="http://schemas.microsoft.com/office/drawing/2016/5/13/chartex" xmlns:cx6="http://schemas.microsoft.com/office/drawing/2016/5/12/chartex" xmlns:cx5="http://schemas.microsoft.com/office/drawing/2016/5/11/chartex" xmlns:cx4="http://schemas.microsoft.com/office/drawing/2016/5/10/chartex" xmlns:cx3="http://schemas.microsoft.com/office/drawing/2016/5/9/chartex" xmlns:cx2="http://schemas.microsoft.com/office/drawing/2015/10/21/chartex">
+                <mc:Fallback xmlns:cx2="http://schemas.microsoft.com/office/drawing/2015/10/21/chartex" xmlns:cx3="http://schemas.microsoft.com/office/drawing/2016/5/9/chartex" xmlns:cx4="http://schemas.microsoft.com/office/drawing/2016/5/10/chartex" xmlns:cx5="http://schemas.microsoft.com/office/drawing/2016/5/11/chartex" xmlns:cx6="http://schemas.microsoft.com/office/drawing/2016/5/12/chartex" xmlns:cx7="http://schemas.microsoft.com/office/drawing/2016/5/13/chartex" xmlns:cx8="http://schemas.microsoft.com/office/drawing/2016/5/14/chartex" xmlns:aink="http://schemas.microsoft.com/office/drawing/2016/ink" xmlns:am3d="http://schemas.microsoft.com/office/drawing/2017/model3d" xmlns:w16cid="http://schemas.microsoft.com/office/word/2016/wordml/cid">
                   <w:pict>
                     <v:group id="Group 3419" o:spid="_x0000_s1026" style="width:27.55pt;height:106.2pt;mso-position-horizontal-relative:char;mso-position-vertical-relative:line" coordsize="3496,13490" o:gfxdata="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">
                       <v:shape id="Shape 4015" o:spid="_x0000_s1027" style="position:absolute;width:3365;height:2641;visibility:visible;mso-wrap-style:square;v-text-anchor:top" coordsize="336550,264160" o:gfxdata="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" path="m,l336550,r,264160l,264160,,e" fillcolor="#ffc000" stroked="f" strokeweight="0">
@@ -2307,7 +2144,6 @@
             <w:r>
               <w:rPr>
                 <w:noProof/>
-                <w:lang w:val="en-US" w:eastAsia="en-US"/>
               </w:rPr>
               <w:drawing>
                 <wp:inline distT="0" distB="0" distL="0" distR="0">
@@ -2323,7 +2159,7 @@
                           <pic:cNvPicPr/>
                         </pic:nvPicPr>
                         <pic:blipFill>
-                          <a:blip r:embed="rId52"/>
+                          <a:blip r:embed="rId33"/>
                           <a:stretch>
                             <a:fillRect/>
                           </a:stretch>
@@ -2363,7 +2199,6 @@
             <w:r>
               <w:rPr>
                 <w:noProof/>
-                <w:lang w:val="en-US" w:eastAsia="en-US"/>
               </w:rPr>
               <w:drawing>
                 <wp:inline distT="0" distB="0" distL="0" distR="0">
@@ -2379,7 +2214,7 @@
                           <pic:cNvPicPr/>
                         </pic:nvPicPr>
                         <pic:blipFill>
-                          <a:blip r:embed="rId52"/>
+                          <a:blip r:embed="rId33"/>
                           <a:stretch>
                             <a:fillRect/>
                           </a:stretch>
@@ -2447,7 +2282,6 @@
             <w:r>
               <w:rPr>
                 <w:noProof/>
-                <w:lang w:val="en-US" w:eastAsia="en-US"/>
               </w:rPr>
               <w:drawing>
                 <wp:inline distT="0" distB="0" distL="0" distR="0">
@@ -2463,7 +2297,7 @@
                           <pic:cNvPicPr/>
                         </pic:nvPicPr>
                         <pic:blipFill>
-                          <a:blip r:embed="rId52"/>
+                          <a:blip r:embed="rId33"/>
                           <a:stretch>
                             <a:fillRect/>
                           </a:stretch>
@@ -2520,7 +2354,6 @@
             <w:r>
               <w:rPr>
                 <w:noProof/>
-                <w:lang w:val="en-US" w:eastAsia="en-US"/>
               </w:rPr>
               <w:drawing>
                 <wp:inline distT="0" distB="0" distL="0" distR="0">
@@ -2536,7 +2369,7 @@
                           <pic:cNvPicPr/>
                         </pic:nvPicPr>
                         <pic:blipFill>
-                          <a:blip r:embed="rId52"/>
+                          <a:blip r:embed="rId33"/>
                           <a:stretch>
                             <a:fillRect/>
                           </a:stretch>
@@ -2575,7 +2408,6 @@
             <w:r>
               <w:rPr>
                 <w:noProof/>
-                <w:lang w:val="en-US" w:eastAsia="en-US"/>
               </w:rPr>
               <w:lastRenderedPageBreak/>
               <mc:AlternateContent>
@@ -2658,7 +2490,7 @@
                     </wp:inline>
                   </w:drawing>
                 </mc:Choice>
-                <mc:Fallback xmlns:a="http://schemas.openxmlformats.org/drawingml/2006/main" xmlns:w16cid="http://schemas.microsoft.com/office/word/2016/wordml/cid" xmlns:am3d="http://schemas.microsoft.com/office/drawing/2017/model3d" xmlns:aink="http://schemas.microsoft.com/office/drawing/2016/ink" xmlns:cx8="http://schemas.microsoft.com/office/drawing/2016/5/14/chartex" xmlns:cx7="http://schemas.microsoft.com/office/drawing/2016/5/13/chartex" xmlns:cx6="http://schemas.microsoft.com/office/drawing/2016/5/12/chartex" xmlns:cx5="http://schemas.microsoft.com/office/drawing/2016/5/11/chartex" xmlns:cx4="http://schemas.microsoft.com/office/drawing/2016/5/10/chartex" xmlns:cx3="http://schemas.microsoft.com/office/drawing/2016/5/9/chartex" xmlns:cx2="http://schemas.microsoft.com/office/drawing/2015/10/21/chartex">
+                <mc:Fallback xmlns:cx2="http://schemas.microsoft.com/office/drawing/2015/10/21/chartex" xmlns:cx3="http://schemas.microsoft.com/office/drawing/2016/5/9/chartex" xmlns:cx4="http://schemas.microsoft.com/office/drawing/2016/5/10/chartex" xmlns:cx5="http://schemas.microsoft.com/office/drawing/2016/5/11/chartex" xmlns:cx6="http://schemas.microsoft.com/office/drawing/2016/5/12/chartex" xmlns:cx7="http://schemas.microsoft.com/office/drawing/2016/5/13/chartex" xmlns:cx8="http://schemas.microsoft.com/office/drawing/2016/5/14/chartex" xmlns:aink="http://schemas.microsoft.com/office/drawing/2016/ink" xmlns:am3d="http://schemas.microsoft.com/office/drawing/2017/model3d" xmlns:w16cid="http://schemas.microsoft.com/office/word/2016/wordml/cid" xmlns:a="http://schemas.openxmlformats.org/drawingml/2006/main">
                   <w:pict>
                     <v:group id="Group 3420" style="width:26.5pt;height:20.8pt;mso-position-horizontal-relative:char;mso-position-vertical-relative:line" coordsize="3365,2641">
                       <v:shape id="Shape 4018" style="position:absolute;width:3365;height:2641;left:0;top:0;" coordsize="336550,264160" path="m0,0l336550,0l336550,264160l0,264160l0,0">
@@ -2838,7 +2670,6 @@
                 <w:color w:val="FFFFFF"/>
                 <w:sz w:val="24"/>
                 <w:szCs w:val="24"/>
-                <w:lang w:val="en-US"/>
               </w:rPr>
               <w:t xml:space="preserve">    </w:t>
             </w:r>
@@ -3847,7 +3678,6 @@
             <w:r>
               <w:rPr>
                 <w:noProof/>
-                <w:lang w:val="en-US" w:eastAsia="en-US"/>
               </w:rPr>
               <mc:AlternateContent>
                 <mc:Choice Requires="wpg">
@@ -3983,7 +3813,7 @@
                     </wp:inline>
                   </w:drawing>
                 </mc:Choice>
-                <mc:Fallback xmlns:a="http://schemas.openxmlformats.org/drawingml/2006/main" xmlns:w16cid="http://schemas.microsoft.com/office/word/2016/wordml/cid" xmlns:am3d="http://schemas.microsoft.com/office/drawing/2017/model3d" xmlns:aink="http://schemas.microsoft.com/office/drawing/2016/ink" xmlns:cx8="http://schemas.microsoft.com/office/drawing/2016/5/14/chartex" xmlns:cx7="http://schemas.microsoft.com/office/drawing/2016/5/13/chartex" xmlns:cx6="http://schemas.microsoft.com/office/drawing/2016/5/12/chartex" xmlns:cx5="http://schemas.microsoft.com/office/drawing/2016/5/11/chartex" xmlns:cx4="http://schemas.microsoft.com/office/drawing/2016/5/10/chartex" xmlns:cx3="http://schemas.microsoft.com/office/drawing/2016/5/9/chartex" xmlns:cx2="http://schemas.microsoft.com/office/drawing/2015/10/21/chartex">
+                <mc:Fallback xmlns:cx2="http://schemas.microsoft.com/office/drawing/2015/10/21/chartex" xmlns:cx3="http://schemas.microsoft.com/office/drawing/2016/5/9/chartex" xmlns:cx4="http://schemas.microsoft.com/office/drawing/2016/5/10/chartex" xmlns:cx5="http://schemas.microsoft.com/office/drawing/2016/5/11/chartex" xmlns:cx6="http://schemas.microsoft.com/office/drawing/2016/5/12/chartex" xmlns:cx7="http://schemas.microsoft.com/office/drawing/2016/5/13/chartex" xmlns:cx8="http://schemas.microsoft.com/office/drawing/2016/5/14/chartex" xmlns:aink="http://schemas.microsoft.com/office/drawing/2016/ink" xmlns:am3d="http://schemas.microsoft.com/office/drawing/2017/model3d" xmlns:w16cid="http://schemas.microsoft.com/office/word/2016/wordml/cid" xmlns:a="http://schemas.openxmlformats.org/drawingml/2006/main">
                   <w:pict>
                     <v:group id="Group 3751" style="width:192pt;height:6.75pt;mso-position-horizontal-relative:char;mso-position-vertical-relative:line" coordsize="24384,857">
                       <v:shape id="Shape 4021" style="position:absolute;width:24384;height:857;left:0;top:0;" coordsize="2438400,85725" path="m0,0l2438400,0l2438400,85725l0,85725l0,0">
@@ -4020,7 +3850,6 @@
             <w:r>
               <w:rPr>
                 <w:noProof/>
-                <w:lang w:val="en-US" w:eastAsia="en-US"/>
               </w:rPr>
               <mc:AlternateContent>
                 <mc:Choice Requires="wpg">
@@ -4156,7 +3985,7 @@
                     </wp:inline>
                   </w:drawing>
                 </mc:Choice>
-                <mc:Fallback xmlns:a="http://schemas.openxmlformats.org/drawingml/2006/main" xmlns:w16cid="http://schemas.microsoft.com/office/word/2016/wordml/cid" xmlns:am3d="http://schemas.microsoft.com/office/drawing/2017/model3d" xmlns:aink="http://schemas.microsoft.com/office/drawing/2016/ink" xmlns:cx8="http://schemas.microsoft.com/office/drawing/2016/5/14/chartex" xmlns:cx7="http://schemas.microsoft.com/office/drawing/2016/5/13/chartex" xmlns:cx6="http://schemas.microsoft.com/office/drawing/2016/5/12/chartex" xmlns:cx5="http://schemas.microsoft.com/office/drawing/2016/5/11/chartex" xmlns:cx4="http://schemas.microsoft.com/office/drawing/2016/5/10/chartex" xmlns:cx3="http://schemas.microsoft.com/office/drawing/2016/5/9/chartex" xmlns:cx2="http://schemas.microsoft.com/office/drawing/2015/10/21/chartex">
+                <mc:Fallback xmlns:cx2="http://schemas.microsoft.com/office/drawing/2015/10/21/chartex" xmlns:cx3="http://schemas.microsoft.com/office/drawing/2016/5/9/chartex" xmlns:cx4="http://schemas.microsoft.com/office/drawing/2016/5/10/chartex" xmlns:cx5="http://schemas.microsoft.com/office/drawing/2016/5/11/chartex" xmlns:cx6="http://schemas.microsoft.com/office/drawing/2016/5/12/chartex" xmlns:cx7="http://schemas.microsoft.com/office/drawing/2016/5/13/chartex" xmlns:cx8="http://schemas.microsoft.com/office/drawing/2016/5/14/chartex" xmlns:aink="http://schemas.microsoft.com/office/drawing/2016/ink" xmlns:am3d="http://schemas.microsoft.com/office/drawing/2017/model3d" xmlns:w16cid="http://schemas.microsoft.com/office/word/2016/wordml/cid" xmlns:a="http://schemas.openxmlformats.org/drawingml/2006/main">
                   <w:pict>
                     <v:group id="Group 3748" style="width:192pt;height:6.75pt;mso-position-horizontal-relative:char;mso-position-vertical-relative:line" coordsize="24384,857">
                       <v:shape id="Shape 4025" style="position:absolute;width:24384;height:857;left:0;top:0;" coordsize="2438400,85725" path="m0,0l2438400,0l2438400,85725l0,85725l0,0">
@@ -4193,7 +4022,6 @@
             <w:r>
               <w:rPr>
                 <w:noProof/>
-                <w:lang w:val="en-US" w:eastAsia="en-US"/>
               </w:rPr>
               <mc:AlternateContent>
                 <mc:Choice Requires="wpg">
@@ -4329,7 +4157,7 @@
                     </wp:inline>
                   </w:drawing>
                 </mc:Choice>
-                <mc:Fallback xmlns:a="http://schemas.openxmlformats.org/drawingml/2006/main" xmlns:w16cid="http://schemas.microsoft.com/office/word/2016/wordml/cid" xmlns:am3d="http://schemas.microsoft.com/office/drawing/2017/model3d" xmlns:aink="http://schemas.microsoft.com/office/drawing/2016/ink" xmlns:cx8="http://schemas.microsoft.com/office/drawing/2016/5/14/chartex" xmlns:cx7="http://schemas.microsoft.com/office/drawing/2016/5/13/chartex" xmlns:cx6="http://schemas.microsoft.com/office/drawing/2016/5/12/chartex" xmlns:cx5="http://schemas.microsoft.com/office/drawing/2016/5/11/chartex" xmlns:cx4="http://schemas.microsoft.com/office/drawing/2016/5/10/chartex" xmlns:cx3="http://schemas.microsoft.com/office/drawing/2016/5/9/chartex" xmlns:cx2="http://schemas.microsoft.com/office/drawing/2015/10/21/chartex">
+                <mc:Fallback xmlns:cx2="http://schemas.microsoft.com/office/drawing/2015/10/21/chartex" xmlns:cx3="http://schemas.microsoft.com/office/drawing/2016/5/9/chartex" xmlns:cx4="http://schemas.microsoft.com/office/drawing/2016/5/10/chartex" xmlns:cx5="http://schemas.microsoft.com/office/drawing/2016/5/11/chartex" xmlns:cx6="http://schemas.microsoft.com/office/drawing/2016/5/12/chartex" xmlns:cx7="http://schemas.microsoft.com/office/drawing/2016/5/13/chartex" xmlns:cx8="http://schemas.microsoft.com/office/drawing/2016/5/14/chartex" xmlns:aink="http://schemas.microsoft.com/office/drawing/2016/ink" xmlns:am3d="http://schemas.microsoft.com/office/drawing/2017/model3d" xmlns:w16cid="http://schemas.microsoft.com/office/word/2016/wordml/cid" xmlns:a="http://schemas.openxmlformats.org/drawingml/2006/main">
                   <w:pict>
                     <v:group id="Group 3750" style="width:192pt;height:6.75pt;mso-position-horizontal-relative:char;mso-position-vertical-relative:line" coordsize="24384,857">
                       <v:shape id="Shape 4029" style="position:absolute;width:24384;height:857;left:0;top:0;" coordsize="2438400,85725" path="m0,0l2438400,0l2438400,85725l0,85725l0,0">
@@ -4365,7 +4193,6 @@
             <w:r>
               <w:rPr>
                 <w:noProof/>
-                <w:lang w:val="en-US" w:eastAsia="en-US"/>
               </w:rPr>
               <mc:AlternateContent>
                 <mc:Choice Requires="wpg">
@@ -4501,7 +4328,7 @@
                     </wp:inline>
                   </w:drawing>
                 </mc:Choice>
-                <mc:Fallback xmlns:a="http://schemas.openxmlformats.org/drawingml/2006/main" xmlns:w16cid="http://schemas.microsoft.com/office/word/2016/wordml/cid" xmlns:am3d="http://schemas.microsoft.com/office/drawing/2017/model3d" xmlns:aink="http://schemas.microsoft.com/office/drawing/2016/ink" xmlns:cx8="http://schemas.microsoft.com/office/drawing/2016/5/14/chartex" xmlns:cx7="http://schemas.microsoft.com/office/drawing/2016/5/13/chartex" xmlns:cx6="http://schemas.microsoft.com/office/drawing/2016/5/12/chartex" xmlns:cx5="http://schemas.microsoft.com/office/drawing/2016/5/11/chartex" xmlns:cx4="http://schemas.microsoft.com/office/drawing/2016/5/10/chartex" xmlns:cx3="http://schemas.microsoft.com/office/drawing/2016/5/9/chartex" xmlns:cx2="http://schemas.microsoft.com/office/drawing/2015/10/21/chartex">
+                <mc:Fallback xmlns:cx2="http://schemas.microsoft.com/office/drawing/2015/10/21/chartex" xmlns:cx3="http://schemas.microsoft.com/office/drawing/2016/5/9/chartex" xmlns:cx4="http://schemas.microsoft.com/office/drawing/2016/5/10/chartex" xmlns:cx5="http://schemas.microsoft.com/office/drawing/2016/5/11/chartex" xmlns:cx6="http://schemas.microsoft.com/office/drawing/2016/5/12/chartex" xmlns:cx7="http://schemas.microsoft.com/office/drawing/2016/5/13/chartex" xmlns:cx8="http://schemas.microsoft.com/office/drawing/2016/5/14/chartex" xmlns:aink="http://schemas.microsoft.com/office/drawing/2016/ink" xmlns:am3d="http://schemas.microsoft.com/office/drawing/2017/model3d" xmlns:w16cid="http://schemas.microsoft.com/office/word/2016/wordml/cid" xmlns:a="http://schemas.openxmlformats.org/drawingml/2006/main">
                   <w:pict>
                     <v:group id="Group 3749" style="width:192pt;height:6.75pt;mso-position-horizontal-relative:char;mso-position-vertical-relative:line" coordsize="24384,857">
                       <v:shape id="Shape 4033" style="position:absolute;width:24384;height:857;left:0;top:0;" coordsize="2438400,85725" path="m0,0l2438400,0l2438400,85725l0,85725l0,0">
@@ -4650,7 +4477,6 @@
       <w:r>
         <w:rPr>
           <w:noProof/>
-          <w:lang w:val="en-US" w:eastAsia="en-US"/>
         </w:rPr>
         <mc:AlternateContent>
           <mc:Choice Requires="wpg">
@@ -4740,7 +4566,7 @@
               </wp:anchor>
             </w:drawing>
           </mc:Choice>
-          <mc:Fallback xmlns:a="http://schemas.openxmlformats.org/drawingml/2006/main" xmlns:w16cid="http://schemas.microsoft.com/office/word/2016/wordml/cid" xmlns:am3d="http://schemas.microsoft.com/office/drawing/2017/model3d" xmlns:aink="http://schemas.microsoft.com/office/drawing/2016/ink" xmlns:cx8="http://schemas.microsoft.com/office/drawing/2016/5/14/chartex" xmlns:cx7="http://schemas.microsoft.com/office/drawing/2016/5/13/chartex" xmlns:cx6="http://schemas.microsoft.com/office/drawing/2016/5/12/chartex" xmlns:cx5="http://schemas.microsoft.com/office/drawing/2016/5/11/chartex" xmlns:cx4="http://schemas.microsoft.com/office/drawing/2016/5/10/chartex" xmlns:cx3="http://schemas.microsoft.com/office/drawing/2016/5/9/chartex" xmlns:cx2="http://schemas.microsoft.com/office/drawing/2015/10/21/chartex">
+          <mc:Fallback xmlns:cx2="http://schemas.microsoft.com/office/drawing/2015/10/21/chartex" xmlns:cx3="http://schemas.microsoft.com/office/drawing/2016/5/9/chartex" xmlns:cx4="http://schemas.microsoft.com/office/drawing/2016/5/10/chartex" xmlns:cx5="http://schemas.microsoft.com/office/drawing/2016/5/11/chartex" xmlns:cx6="http://schemas.microsoft.com/office/drawing/2016/5/12/chartex" xmlns:cx7="http://schemas.microsoft.com/office/drawing/2016/5/13/chartex" xmlns:cx8="http://schemas.microsoft.com/office/drawing/2016/5/14/chartex" xmlns:aink="http://schemas.microsoft.com/office/drawing/2016/ink" xmlns:am3d="http://schemas.microsoft.com/office/drawing/2017/model3d" xmlns:w16cid="http://schemas.microsoft.com/office/word/2016/wordml/cid" xmlns:a="http://schemas.openxmlformats.org/drawingml/2006/main">
             <w:pict>
               <v:group id="Group 3806" style="width:26.5pt;height:16pt;position:absolute;mso-position-horizontal-relative:page;mso-position-horizontal:absolute;margin-left:0pt;mso-position-vertical-relative:page;margin-top:0pt;" coordsize="3365,2032">
                 <v:shape id="Shape 4036" style="position:absolute;width:3365;height:2032;left:0;top:0;" coordsize="336550,203200" path="m0,0l336550,0l336550,203200l0,203200l0,0">
@@ -5472,7 +5298,7 @@
         <w:rFonts w:asciiTheme="minorHAnsi" w:eastAsiaTheme="minorEastAsia" w:hAnsiTheme="minorHAnsi" w:cstheme="minorBidi"/>
         <w:sz w:val="22"/>
         <w:szCs w:val="22"/>
-        <w:lang w:bidi="ar-SA"/>
+        <w:lang w:val="en-US" w:eastAsia="en-US" w:bidi="ar-SA"/>
       </w:rPr>
     </w:rPrDefault>
     <w:pPrDefault>
@@ -5995,6 +5821,17 @@
       <w:color w:val="000000"/>
     </w:rPr>
   </w:style>
+  <w:style w:type="character" w:styleId="Hyperlink">
+    <w:name w:val="Hyperlink"/>
+    <w:basedOn w:val="DefaultParagraphFont"/>
+    <w:uiPriority w:val="99"/>
+    <w:unhideWhenUsed/>
+    <w:rsid w:val="00391C56"/>
+    <w:rPr>
+      <w:color w:val="0563C1" w:themeColor="hyperlink"/>
+      <w:u w:val="single"/>
+    </w:rPr>
+  </w:style>
 </w:styles>
 </file>
 

</xml_diff>